<commit_message>
Add a three-day prep schedule to the 9 September document
Monday make-ahead, Tuesday cook and crumb, Wednesday service, each
task with a tick box.

Co-Authored-By: Claude Opus 5 <noreply@anthropic.com>
Claude-Session: https://claude.ai/code/session_01Xfce5MJmenZg4jNRY1BeeJ
</commit_message>
<xml_diff>
--- a/Order & Prep Sheet - 9 September.docx
+++ b/Order & Prep Sheet - 9 September.docx
@@ -10816,6 +10816,2464 @@
         <w:t xml:space="preserve"/>
       </w:r>
     </w:p>
+    <w:p>
+      <w:r>
+        <w:br w:type="page"/>
+      </w:r>
+    </w:p>
+    <w:p>
+      <w:pPr>
+        <w:pStyle w:val="Heading1"/>
+        <w:spacing w:after="160" w:before="320"/>
+      </w:pPr>
+      <w:r>
+        <w:t xml:space="preserve">Prep schedule</w:t>
+      </w:r>
+    </w:p>
+    <w:p>
+      <w:pPr>
+        <w:spacing w:after="160" w:before="0"/>
+      </w:pPr>
+      <w:r>
+        <w:rPr>
+          <w:rFonts w:ascii="Calibri" w:cs="Calibri" w:eastAsia="Calibri" w:hAnsi="Calibri"/>
+          <w:color w:val="5C6560"/>
+          <w:sz w:val="18"/>
+          <w:szCs w:val="18"/>
+        </w:rPr>
+        <w:t xml:space="preserve">Three days, front-loaded so Wednesday is assembly and frying only. Anything that can be made ahead is.</w:t>
+      </w:r>
+    </w:p>
+    <w:p>
+      <w:pPr>
+        <w:pStyle w:val="Heading2"/>
+        <w:spacing w:after="120" w:before="260"/>
+      </w:pPr>
+      <w:r>
+        <w:t xml:space="preserve">Monday 7 September — make-ahead</w:t>
+      </w:r>
+    </w:p>
+    <w:tbl>
+      <w:tblPr>
+        <w:tblW w:type="dxa" w:w="10000"/>
+        <w:tblBorders>
+          <w:top w:val="single" w:color="BFC6BA" w:sz="2"/>
+          <w:left w:val="none"/>
+          <w:bottom w:val="single" w:color="BFC6BA" w:sz="2"/>
+          <w:right w:val="none"/>
+          <w:insideH w:val="single" w:color="BFC6BA" w:sz="2"/>
+          <w:insideV w:val="none"/>
+        </w:tblBorders>
+      </w:tblPr>
+      <w:tblGrid>
+        <w:gridCol w:w="3000"/>
+        <w:gridCol w:w="6300"/>
+        <w:gridCol w:w="700"/>
+      </w:tblGrid>
+      <w:tr>
+        <w:trPr>
+          <w:tblHeader/>
+        </w:trPr>
+        <w:tc>
+          <w:tcPr>
+            <w:tcW w:type="dxa" w:w="3000"/>
+            <w:shd w:fill="E6E8E2" w:color="auto" w:val="clear"/>
+            <w:tcMar>
+              <w:top w:type="dxa" w:w="60"/>
+              <w:left w:type="dxa" w:w="100"/>
+              <w:bottom w:type="dxa" w:w="60"/>
+              <w:right w:type="dxa" w:w="100"/>
+            </w:tcMar>
+          </w:tcPr>
+          <w:p>
+            <w:pPr>
+              <w:spacing w:after="0"/>
+            </w:pPr>
+            <w:r>
+              <w:rPr>
+                <w:rFonts w:ascii="Calibri" w:cs="Calibri" w:eastAsia="Calibri" w:hAnsi="Calibri"/>
+                <w:b/>
+                <w:bCs/>
+                <w:color w:val="14181A"/>
+                <w:sz w:val="19"/>
+                <w:szCs w:val="19"/>
+              </w:rPr>
+              <w:t xml:space="preserve">Task</w:t>
+            </w:r>
+          </w:p>
+        </w:tc>
+        <w:tc>
+          <w:tcPr>
+            <w:tcW w:type="dxa" w:w="6300"/>
+            <w:shd w:fill="E6E8E2" w:color="auto" w:val="clear"/>
+            <w:tcMar>
+              <w:top w:type="dxa" w:w="60"/>
+              <w:left w:type="dxa" w:w="100"/>
+              <w:bottom w:type="dxa" w:w="60"/>
+              <w:right w:type="dxa" w:w="100"/>
+            </w:tcMar>
+          </w:tcPr>
+          <w:p>
+            <w:pPr>
+              <w:spacing w:after="0"/>
+            </w:pPr>
+            <w:r>
+              <w:rPr>
+                <w:rFonts w:ascii="Calibri" w:cs="Calibri" w:eastAsia="Calibri" w:hAnsi="Calibri"/>
+                <w:b/>
+                <w:bCs/>
+                <w:color w:val="14181A"/>
+                <w:sz w:val="19"/>
+                <w:szCs w:val="19"/>
+              </w:rPr>
+              <w:t xml:space="preserve">What it involves</w:t>
+            </w:r>
+          </w:p>
+        </w:tc>
+        <w:tc>
+          <w:tcPr>
+            <w:tcW w:type="dxa" w:w="700"/>
+            <w:shd w:fill="E6E8E2" w:color="auto" w:val="clear"/>
+            <w:tcMar>
+              <w:top w:type="dxa" w:w="60"/>
+              <w:left w:type="dxa" w:w="100"/>
+              <w:bottom w:type="dxa" w:w="60"/>
+              <w:right w:type="dxa" w:w="100"/>
+            </w:tcMar>
+          </w:tcPr>
+          <w:p>
+            <w:pPr>
+              <w:spacing w:after="0"/>
+            </w:pPr>
+            <w:r>
+              <w:rPr>
+                <w:rFonts w:ascii="Calibri" w:cs="Calibri" w:eastAsia="Calibri" w:hAnsi="Calibri"/>
+                <w:b/>
+                <w:bCs/>
+                <w:color w:val="14181A"/>
+                <w:sz w:val="16"/>
+                <w:szCs w:val="16"/>
+              </w:rPr>
+              <w:t xml:space="preserve">Done</w:t>
+            </w:r>
+          </w:p>
+        </w:tc>
+      </w:tr>
+      <w:tr>
+        <w:tc>
+          <w:tcPr>
+            <w:tcW w:type="dxa" w:w="3000"/>
+            <w:tcMar>
+              <w:top w:type="dxa" w:w="60"/>
+              <w:left w:type="dxa" w:w="100"/>
+              <w:bottom w:type="dxa" w:w="60"/>
+              <w:right w:type="dxa" w:w="100"/>
+            </w:tcMar>
+          </w:tcPr>
+          <w:p>
+            <w:pPr>
+              <w:spacing w:after="0"/>
+            </w:pPr>
+            <w:r>
+              <w:rPr>
+                <w:rFonts w:ascii="Calibri" w:cs="Calibri" w:eastAsia="Calibri" w:hAnsi="Calibri"/>
+                <w:b/>
+                <w:bCs/>
+                <w:color w:val="14181A"/>
+                <w:sz w:val="19"/>
+                <w:szCs w:val="19"/>
+              </w:rPr>
+              <w:t xml:space="preserve">Deliveries in</w:t>
+            </w:r>
+          </w:p>
+        </w:tc>
+        <w:tc>
+          <w:tcPr>
+            <w:tcW w:type="dxa" w:w="6300"/>
+            <w:tcMar>
+              <w:top w:type="dxa" w:w="60"/>
+              <w:left w:type="dxa" w:w="100"/>
+              <w:bottom w:type="dxa" w:w="60"/>
+              <w:right w:type="dxa" w:w="100"/>
+            </w:tcMar>
+          </w:tcPr>
+          <w:p>
+            <w:pPr>
+              <w:spacing w:after="0"/>
+            </w:pPr>
+            <w:r>
+              <w:rPr>
+                <w:rFonts w:ascii="Calibri" w:cs="Calibri" w:eastAsia="Calibri" w:hAnsi="Calibri"/>
+                <w:color w:val="14181A"/>
+                <w:sz w:val="18"/>
+                <w:szCs w:val="18"/>
+              </w:rPr>
+              <w:t xml:space="preserve">Check everything against the order list. Chase anything short today, not Tuesday.</w:t>
+            </w:r>
+          </w:p>
+        </w:tc>
+        <w:tc>
+          <w:tcPr>
+            <w:tcW w:type="dxa" w:w="700"/>
+            <w:tcMar>
+              <w:top w:type="dxa" w:w="60"/>
+              <w:left w:type="dxa" w:w="100"/>
+              <w:bottom w:type="dxa" w:w="60"/>
+              <w:right w:type="dxa" w:w="100"/>
+            </w:tcMar>
+          </w:tcPr>
+          <w:p>
+            <w:pPr>
+              <w:spacing w:after="0"/>
+            </w:pPr>
+            <w:r>
+              <w:rPr>
+                <w:rFonts w:ascii="Calibri" w:cs="Calibri" w:eastAsia="Calibri" w:hAnsi="Calibri"/>
+                <w:color w:val="5C6560"/>
+                <w:sz w:val="22"/>
+                <w:szCs w:val="22"/>
+              </w:rPr>
+              <w:t xml:space="preserve">□</w:t>
+            </w:r>
+          </w:p>
+        </w:tc>
+      </w:tr>
+      <w:tr>
+        <w:tc>
+          <w:tcPr>
+            <w:tcW w:type="dxa" w:w="3000"/>
+            <w:tcMar>
+              <w:top w:type="dxa" w:w="60"/>
+              <w:left w:type="dxa" w:w="100"/>
+              <w:bottom w:type="dxa" w:w="60"/>
+              <w:right w:type="dxa" w:w="100"/>
+            </w:tcMar>
+          </w:tcPr>
+          <w:p>
+            <w:pPr>
+              <w:spacing w:after="0"/>
+            </w:pPr>
+            <w:r>
+              <w:rPr>
+                <w:rFonts w:ascii="Calibri" w:cs="Calibri" w:eastAsia="Calibri" w:hAnsi="Calibri"/>
+                <w:b/>
+                <w:bCs/>
+                <w:color w:val="14181A"/>
+                <w:sz w:val="19"/>
+                <w:szCs w:val="19"/>
+              </w:rPr>
+              <w:t xml:space="preserve">Croquette test batch</w:t>
+            </w:r>
+          </w:p>
+        </w:tc>
+        <w:tc>
+          <w:tcPr>
+            <w:tcW w:type="dxa" w:w="6300"/>
+            <w:tcMar>
+              <w:top w:type="dxa" w:w="60"/>
+              <w:left w:type="dxa" w:w="100"/>
+              <w:bottom w:type="dxa" w:w="60"/>
+              <w:right w:type="dxa" w:w="100"/>
+            </w:tcMar>
+          </w:tcPr>
+          <w:p>
+            <w:pPr>
+              <w:spacing w:after="0"/>
+            </w:pPr>
+            <w:r>
+              <w:rPr>
+                <w:rFonts w:ascii="Calibri" w:cs="Calibri" w:eastAsia="Calibri" w:hAnsi="Calibri"/>
+                <w:color w:val="14181A"/>
+                <w:sz w:val="18"/>
+                <w:szCs w:val="18"/>
+              </w:rPr>
+              <w:t xml:space="preserve">Make 12 portions to the recipe and tray it up. If the panada has not set firm enough to roll by Tuesday morning, the full mix needs less stock or more roux — this is the batch that tells you.</w:t>
+            </w:r>
+          </w:p>
+        </w:tc>
+        <w:tc>
+          <w:tcPr>
+            <w:tcW w:type="dxa" w:w="700"/>
+            <w:tcMar>
+              <w:top w:type="dxa" w:w="60"/>
+              <w:left w:type="dxa" w:w="100"/>
+              <w:bottom w:type="dxa" w:w="60"/>
+              <w:right w:type="dxa" w:w="100"/>
+            </w:tcMar>
+          </w:tcPr>
+          <w:p>
+            <w:pPr>
+              <w:spacing w:after="0"/>
+            </w:pPr>
+            <w:r>
+              <w:rPr>
+                <w:rFonts w:ascii="Calibri" w:cs="Calibri" w:eastAsia="Calibri" w:hAnsi="Calibri"/>
+                <w:color w:val="5C6560"/>
+                <w:sz w:val="22"/>
+                <w:szCs w:val="22"/>
+              </w:rPr>
+              <w:t xml:space="preserve">□</w:t>
+            </w:r>
+          </w:p>
+        </w:tc>
+      </w:tr>
+      <w:tr>
+        <w:tc>
+          <w:tcPr>
+            <w:tcW w:type="dxa" w:w="3000"/>
+            <w:tcMar>
+              <w:top w:type="dxa" w:w="60"/>
+              <w:left w:type="dxa" w:w="100"/>
+              <w:bottom w:type="dxa" w:w="60"/>
+              <w:right w:type="dxa" w:w="100"/>
+            </w:tcMar>
+          </w:tcPr>
+          <w:p>
+            <w:pPr>
+              <w:spacing w:after="0"/>
+            </w:pPr>
+            <w:r>
+              <w:rPr>
+                <w:rFonts w:ascii="Calibri" w:cs="Calibri" w:eastAsia="Calibri" w:hAnsi="Calibri"/>
+                <w:b/>
+                <w:bCs/>
+                <w:color w:val="14181A"/>
+                <w:sz w:val="19"/>
+                <w:szCs w:val="19"/>
+              </w:rPr>
+              <w:t xml:space="preserve">Croquette mix</w:t>
+            </w:r>
+          </w:p>
+        </w:tc>
+        <w:tc>
+          <w:tcPr>
+            <w:tcW w:type="dxa" w:w="6300"/>
+            <w:tcMar>
+              <w:top w:type="dxa" w:w="60"/>
+              <w:left w:type="dxa" w:w="100"/>
+              <w:bottom w:type="dxa" w:w="60"/>
+              <w:right w:type="dxa" w:w="100"/>
+            </w:tcMar>
+          </w:tcPr>
+          <w:p>
+            <w:pPr>
+              <w:spacing w:after="0"/>
+            </w:pPr>
+            <w:r>
+              <w:rPr>
+                <w:rFonts w:ascii="Calibri" w:cs="Calibri" w:eastAsia="Calibri" w:hAnsi="Calibri"/>
+                <w:color w:val="14181A"/>
+                <w:sz w:val="18"/>
+                <w:szCs w:val="18"/>
+              </w:rPr>
+              <w:t xml:space="preserve">Poach 2.5 kg thigh in the stock, shred. Roux, panada, fold through chicken, parmesan, anchovy, garlic, parsley. Spread 3 cm into lined trays, cling the surface, chill overnight.</w:t>
+            </w:r>
+          </w:p>
+        </w:tc>
+        <w:tc>
+          <w:tcPr>
+            <w:tcW w:type="dxa" w:w="700"/>
+            <w:tcMar>
+              <w:top w:type="dxa" w:w="60"/>
+              <w:left w:type="dxa" w:w="100"/>
+              <w:bottom w:type="dxa" w:w="60"/>
+              <w:right w:type="dxa" w:w="100"/>
+            </w:tcMar>
+          </w:tcPr>
+          <w:p>
+            <w:pPr>
+              <w:spacing w:after="0"/>
+            </w:pPr>
+            <w:r>
+              <w:rPr>
+                <w:rFonts w:ascii="Calibri" w:cs="Calibri" w:eastAsia="Calibri" w:hAnsi="Calibri"/>
+                <w:color w:val="5C6560"/>
+                <w:sz w:val="22"/>
+                <w:szCs w:val="22"/>
+              </w:rPr>
+              <w:t xml:space="preserve">□</w:t>
+            </w:r>
+          </w:p>
+        </w:tc>
+      </w:tr>
+      <w:tr>
+        <w:tc>
+          <w:tcPr>
+            <w:tcW w:type="dxa" w:w="3000"/>
+            <w:tcMar>
+              <w:top w:type="dxa" w:w="60"/>
+              <w:left w:type="dxa" w:w="100"/>
+              <w:bottom w:type="dxa" w:w="60"/>
+              <w:right w:type="dxa" w:w="100"/>
+            </w:tcMar>
+          </w:tcPr>
+          <w:p>
+            <w:pPr>
+              <w:spacing w:after="0"/>
+            </w:pPr>
+            <w:r>
+              <w:rPr>
+                <w:rFonts w:ascii="Calibri" w:cs="Calibri" w:eastAsia="Calibri" w:hAnsi="Calibri"/>
+                <w:b/>
+                <w:bCs/>
+                <w:color w:val="14181A"/>
+                <w:sz w:val="19"/>
+                <w:szCs w:val="19"/>
+              </w:rPr>
+              <w:t xml:space="preserve">Potato hash</w:t>
+            </w:r>
+          </w:p>
+        </w:tc>
+        <w:tc>
+          <w:tcPr>
+            <w:tcW w:type="dxa" w:w="6300"/>
+            <w:tcMar>
+              <w:top w:type="dxa" w:w="60"/>
+              <w:left w:type="dxa" w:w="100"/>
+              <w:bottom w:type="dxa" w:w="60"/>
+              <w:right w:type="dxa" w:w="100"/>
+            </w:tcMar>
+          </w:tcPr>
+          <w:p>
+            <w:pPr>
+              <w:spacing w:after="0"/>
+            </w:pPr>
+            <w:r>
+              <w:rPr>
+                <w:rFonts w:ascii="Calibri" w:cs="Calibri" w:eastAsia="Calibri" w:hAnsi="Calibri"/>
+                <w:color w:val="14181A"/>
+                <w:sz w:val="18"/>
+                <w:szCs w:val="18"/>
+              </w:rPr>
+              <w:t xml:space="preserve">Grate 15 kg Agria and wring out hard. Mix with butter, cornflour, seasonings. Press into lined trays, bake 180°C 45–60 min, cool, press under weight overnight.</w:t>
+            </w:r>
+          </w:p>
+        </w:tc>
+        <w:tc>
+          <w:tcPr>
+            <w:tcW w:type="dxa" w:w="700"/>
+            <w:tcMar>
+              <w:top w:type="dxa" w:w="60"/>
+              <w:left w:type="dxa" w:w="100"/>
+              <w:bottom w:type="dxa" w:w="60"/>
+              <w:right w:type="dxa" w:w="100"/>
+            </w:tcMar>
+          </w:tcPr>
+          <w:p>
+            <w:pPr>
+              <w:spacing w:after="0"/>
+            </w:pPr>
+            <w:r>
+              <w:rPr>
+                <w:rFonts w:ascii="Calibri" w:cs="Calibri" w:eastAsia="Calibri" w:hAnsi="Calibri"/>
+                <w:color w:val="5C6560"/>
+                <w:sz w:val="22"/>
+                <w:szCs w:val="22"/>
+              </w:rPr>
+              <w:t xml:space="preserve">□</w:t>
+            </w:r>
+          </w:p>
+        </w:tc>
+      </w:tr>
+      <w:tr>
+        <w:tc>
+          <w:tcPr>
+            <w:tcW w:type="dxa" w:w="3000"/>
+            <w:tcMar>
+              <w:top w:type="dxa" w:w="60"/>
+              <w:left w:type="dxa" w:w="100"/>
+              <w:bottom w:type="dxa" w:w="60"/>
+              <w:right w:type="dxa" w:w="100"/>
+            </w:tcMar>
+          </w:tcPr>
+          <w:p>
+            <w:pPr>
+              <w:spacing w:after="0"/>
+            </w:pPr>
+            <w:r>
+              <w:rPr>
+                <w:rFonts w:ascii="Calibri" w:cs="Calibri" w:eastAsia="Calibri" w:hAnsi="Calibri"/>
+                <w:b/>
+                <w:bCs/>
+                <w:color w:val="14181A"/>
+                <w:sz w:val="19"/>
+                <w:szCs w:val="19"/>
+              </w:rPr>
+              <w:t xml:space="preserve">Whipped feta</w:t>
+            </w:r>
+          </w:p>
+        </w:tc>
+        <w:tc>
+          <w:tcPr>
+            <w:tcW w:type="dxa" w:w="6300"/>
+            <w:tcMar>
+              <w:top w:type="dxa" w:w="60"/>
+              <w:left w:type="dxa" w:w="100"/>
+              <w:bottom w:type="dxa" w:w="60"/>
+              <w:right w:type="dxa" w:w="100"/>
+            </w:tcMar>
+          </w:tcPr>
+          <w:p>
+            <w:pPr>
+              <w:spacing w:after="0"/>
+            </w:pPr>
+            <w:r>
+              <w:rPr>
+                <w:rFonts w:ascii="Calibri" w:cs="Calibri" w:eastAsia="Calibri" w:hAnsi="Calibri"/>
+                <w:color w:val="14181A"/>
+                <w:sz w:val="18"/>
+                <w:szCs w:val="18"/>
+              </w:rPr>
+              <w:t xml:space="preserve">Blitz 3 kg feta with cream cheese and yoghurt, lemon, oil. Bag with 10 mm nozzle, chill. (Can slip to Tuesday.)</w:t>
+            </w:r>
+          </w:p>
+        </w:tc>
+        <w:tc>
+          <w:tcPr>
+            <w:tcW w:type="dxa" w:w="700"/>
+            <w:tcMar>
+              <w:top w:type="dxa" w:w="60"/>
+              <w:left w:type="dxa" w:w="100"/>
+              <w:bottom w:type="dxa" w:w="60"/>
+              <w:right w:type="dxa" w:w="100"/>
+            </w:tcMar>
+          </w:tcPr>
+          <w:p>
+            <w:pPr>
+              <w:spacing w:after="0"/>
+            </w:pPr>
+            <w:r>
+              <w:rPr>
+                <w:rFonts w:ascii="Calibri" w:cs="Calibri" w:eastAsia="Calibri" w:hAnsi="Calibri"/>
+                <w:color w:val="5C6560"/>
+                <w:sz w:val="22"/>
+                <w:szCs w:val="22"/>
+              </w:rPr>
+              <w:t xml:space="preserve">□</w:t>
+            </w:r>
+          </w:p>
+        </w:tc>
+      </w:tr>
+      <w:tr>
+        <w:tc>
+          <w:tcPr>
+            <w:tcW w:type="dxa" w:w="3000"/>
+            <w:tcMar>
+              <w:top w:type="dxa" w:w="60"/>
+              <w:left w:type="dxa" w:w="100"/>
+              <w:bottom w:type="dxa" w:w="60"/>
+              <w:right w:type="dxa" w:w="100"/>
+            </w:tcMar>
+          </w:tcPr>
+          <w:p>
+            <w:pPr>
+              <w:spacing w:after="0"/>
+            </w:pPr>
+            <w:r>
+              <w:rPr>
+                <w:rFonts w:ascii="Calibri" w:cs="Calibri" w:eastAsia="Calibri" w:hAnsi="Calibri"/>
+                <w:b/>
+                <w:bCs/>
+                <w:color w:val="14181A"/>
+                <w:sz w:val="19"/>
+                <w:szCs w:val="19"/>
+              </w:rPr>
+              <w:t xml:space="preserve">Thyme crumb ×15</w:t>
+            </w:r>
+          </w:p>
+        </w:tc>
+        <w:tc>
+          <w:tcPr>
+            <w:tcW w:type="dxa" w:w="6300"/>
+            <w:tcMar>
+              <w:top w:type="dxa" w:w="60"/>
+              <w:left w:type="dxa" w:w="100"/>
+              <w:bottom w:type="dxa" w:w="60"/>
+              <w:right w:type="dxa" w:w="100"/>
+            </w:tcMar>
+          </w:tcPr>
+          <w:p>
+            <w:pPr>
+              <w:spacing w:after="0"/>
+            </w:pPr>
+            <w:r>
+              <w:rPr>
+                <w:rFonts w:ascii="Calibri" w:cs="Calibri" w:eastAsia="Calibri" w:hAnsi="Calibri"/>
+                <w:color w:val="14181A"/>
+                <w:sz w:val="18"/>
+                <w:szCs w:val="18"/>
+              </w:rPr>
+              <w:t xml:space="preserve">1.5 kg crumbs through oil and garlic, 170°C 8–10 min across 3–4 trays, thyme in for the last 2 min only. Cool, fold in parmesan and zest, airtight.</w:t>
+            </w:r>
+          </w:p>
+        </w:tc>
+        <w:tc>
+          <w:tcPr>
+            <w:tcW w:type="dxa" w:w="700"/>
+            <w:tcMar>
+              <w:top w:type="dxa" w:w="60"/>
+              <w:left w:type="dxa" w:w="100"/>
+              <w:bottom w:type="dxa" w:w="60"/>
+              <w:right w:type="dxa" w:w="100"/>
+            </w:tcMar>
+          </w:tcPr>
+          <w:p>
+            <w:pPr>
+              <w:spacing w:after="0"/>
+            </w:pPr>
+            <w:r>
+              <w:rPr>
+                <w:rFonts w:ascii="Calibri" w:cs="Calibri" w:eastAsia="Calibri" w:hAnsi="Calibri"/>
+                <w:color w:val="5C6560"/>
+                <w:sz w:val="22"/>
+                <w:szCs w:val="22"/>
+              </w:rPr>
+              <w:t xml:space="preserve">□</w:t>
+            </w:r>
+          </w:p>
+        </w:tc>
+      </w:tr>
+      <w:tr>
+        <w:tc>
+          <w:tcPr>
+            <w:tcW w:type="dxa" w:w="3000"/>
+            <w:tcMar>
+              <w:top w:type="dxa" w:w="60"/>
+              <w:left w:type="dxa" w:w="100"/>
+              <w:bottom w:type="dxa" w:w="60"/>
+              <w:right w:type="dxa" w:w="100"/>
+            </w:tcMar>
+          </w:tcPr>
+          <w:p>
+            <w:pPr>
+              <w:spacing w:after="0"/>
+            </w:pPr>
+            <w:r>
+              <w:rPr>
+                <w:rFonts w:ascii="Calibri" w:cs="Calibri" w:eastAsia="Calibri" w:hAnsi="Calibri"/>
+                <w:b/>
+                <w:bCs/>
+                <w:color w:val="14181A"/>
+                <w:sz w:val="19"/>
+                <w:szCs w:val="19"/>
+              </w:rPr>
+              <w:t xml:space="preserve">Hot honey</w:t>
+            </w:r>
+          </w:p>
+        </w:tc>
+        <w:tc>
+          <w:tcPr>
+            <w:tcW w:type="dxa" w:w="6300"/>
+            <w:tcMar>
+              <w:top w:type="dxa" w:w="60"/>
+              <w:left w:type="dxa" w:w="100"/>
+              <w:bottom w:type="dxa" w:w="60"/>
+              <w:right w:type="dxa" w:w="100"/>
+            </w:tcMar>
+          </w:tcPr>
+          <w:p>
+            <w:pPr>
+              <w:spacing w:after="0"/>
+            </w:pPr>
+            <w:r>
+              <w:rPr>
+                <w:rFonts w:ascii="Calibri" w:cs="Calibri" w:eastAsia="Calibri" w:hAnsi="Calibri"/>
+                <w:color w:val="14181A"/>
+                <w:sz w:val="18"/>
+                <w:szCs w:val="18"/>
+              </w:rPr>
+              <w:t xml:space="preserve">1 kg honey to 55°C, chilli, vinegar, salt. Infuse and hold — it keeps building heat.</w:t>
+            </w:r>
+          </w:p>
+        </w:tc>
+        <w:tc>
+          <w:tcPr>
+            <w:tcW w:type="dxa" w:w="700"/>
+            <w:tcMar>
+              <w:top w:type="dxa" w:w="60"/>
+              <w:left w:type="dxa" w:w="100"/>
+              <w:bottom w:type="dxa" w:w="60"/>
+              <w:right w:type="dxa" w:w="100"/>
+            </w:tcMar>
+          </w:tcPr>
+          <w:p>
+            <w:pPr>
+              <w:spacing w:after="0"/>
+            </w:pPr>
+            <w:r>
+              <w:rPr>
+                <w:rFonts w:ascii="Calibri" w:cs="Calibri" w:eastAsia="Calibri" w:hAnsi="Calibri"/>
+                <w:color w:val="5C6560"/>
+                <w:sz w:val="22"/>
+                <w:szCs w:val="22"/>
+              </w:rPr>
+              <w:t xml:space="preserve">□</w:t>
+            </w:r>
+          </w:p>
+        </w:tc>
+      </w:tr>
+    </w:tbl>
+    <w:p>
+      <w:pPr>
+        <w:spacing w:after="80" w:before="0"/>
+      </w:pPr>
+      <w:r>
+        <w:rPr>
+          <w:rFonts w:ascii="Calibri" w:cs="Calibri" w:eastAsia="Calibri" w:hAnsi="Calibri"/>
+          <w:color w:val="14181A"/>
+          <w:sz w:val="20"/>
+          <w:szCs w:val="20"/>
+        </w:rPr>
+        <w:t xml:space="preserve"/>
+      </w:r>
+    </w:p>
+    <w:p>
+      <w:pPr>
+        <w:pStyle w:val="Heading2"/>
+        <w:spacing w:after="120" w:before="260"/>
+      </w:pPr>
+      <w:r>
+        <w:t xml:space="preserve">Tuesday 8 September — the heavy day</w:t>
+      </w:r>
+    </w:p>
+    <w:tbl>
+      <w:tblPr>
+        <w:tblW w:type="dxa" w:w="10000"/>
+        <w:tblBorders>
+          <w:top w:val="single" w:color="BFC6BA" w:sz="2"/>
+          <w:left w:val="none"/>
+          <w:bottom w:val="single" w:color="BFC6BA" w:sz="2"/>
+          <w:right w:val="none"/>
+          <w:insideH w:val="single" w:color="BFC6BA" w:sz="2"/>
+          <w:insideV w:val="none"/>
+        </w:tblBorders>
+      </w:tblPr>
+      <w:tblGrid>
+        <w:gridCol w:w="3000"/>
+        <w:gridCol w:w="6300"/>
+        <w:gridCol w:w="700"/>
+      </w:tblGrid>
+      <w:tr>
+        <w:trPr>
+          <w:tblHeader/>
+        </w:trPr>
+        <w:tc>
+          <w:tcPr>
+            <w:tcW w:type="dxa" w:w="3000"/>
+            <w:shd w:fill="E6E8E2" w:color="auto" w:val="clear"/>
+            <w:tcMar>
+              <w:top w:type="dxa" w:w="60"/>
+              <w:left w:type="dxa" w:w="100"/>
+              <w:bottom w:type="dxa" w:w="60"/>
+              <w:right w:type="dxa" w:w="100"/>
+            </w:tcMar>
+          </w:tcPr>
+          <w:p>
+            <w:pPr>
+              <w:spacing w:after="0"/>
+            </w:pPr>
+            <w:r>
+              <w:rPr>
+                <w:rFonts w:ascii="Calibri" w:cs="Calibri" w:eastAsia="Calibri" w:hAnsi="Calibri"/>
+                <w:b/>
+                <w:bCs/>
+                <w:color w:val="14181A"/>
+                <w:sz w:val="19"/>
+                <w:szCs w:val="19"/>
+              </w:rPr>
+              <w:t xml:space="preserve">Task</w:t>
+            </w:r>
+          </w:p>
+        </w:tc>
+        <w:tc>
+          <w:tcPr>
+            <w:tcW w:type="dxa" w:w="6300"/>
+            <w:shd w:fill="E6E8E2" w:color="auto" w:val="clear"/>
+            <w:tcMar>
+              <w:top w:type="dxa" w:w="60"/>
+              <w:left w:type="dxa" w:w="100"/>
+              <w:bottom w:type="dxa" w:w="60"/>
+              <w:right w:type="dxa" w:w="100"/>
+            </w:tcMar>
+          </w:tcPr>
+          <w:p>
+            <w:pPr>
+              <w:spacing w:after="0"/>
+            </w:pPr>
+            <w:r>
+              <w:rPr>
+                <w:rFonts w:ascii="Calibri" w:cs="Calibri" w:eastAsia="Calibri" w:hAnsi="Calibri"/>
+                <w:b/>
+                <w:bCs/>
+                <w:color w:val="14181A"/>
+                <w:sz w:val="19"/>
+                <w:szCs w:val="19"/>
+              </w:rPr>
+              <w:t xml:space="preserve">What it involves</w:t>
+            </w:r>
+          </w:p>
+        </w:tc>
+        <w:tc>
+          <w:tcPr>
+            <w:tcW w:type="dxa" w:w="700"/>
+            <w:shd w:fill="E6E8E2" w:color="auto" w:val="clear"/>
+            <w:tcMar>
+              <w:top w:type="dxa" w:w="60"/>
+              <w:left w:type="dxa" w:w="100"/>
+              <w:bottom w:type="dxa" w:w="60"/>
+              <w:right w:type="dxa" w:w="100"/>
+            </w:tcMar>
+          </w:tcPr>
+          <w:p>
+            <w:pPr>
+              <w:spacing w:after="0"/>
+            </w:pPr>
+            <w:r>
+              <w:rPr>
+                <w:rFonts w:ascii="Calibri" w:cs="Calibri" w:eastAsia="Calibri" w:hAnsi="Calibri"/>
+                <w:b/>
+                <w:bCs/>
+                <w:color w:val="14181A"/>
+                <w:sz w:val="16"/>
+                <w:szCs w:val="16"/>
+              </w:rPr>
+              <w:t xml:space="preserve">Done</w:t>
+            </w:r>
+          </w:p>
+        </w:tc>
+      </w:tr>
+      <w:tr>
+        <w:tc>
+          <w:tcPr>
+            <w:tcW w:type="dxa" w:w="3000"/>
+            <w:tcMar>
+              <w:top w:type="dxa" w:w="60"/>
+              <w:left w:type="dxa" w:w="100"/>
+              <w:bottom w:type="dxa" w:w="60"/>
+              <w:right w:type="dxa" w:w="100"/>
+            </w:tcMar>
+          </w:tcPr>
+          <w:p>
+            <w:pPr>
+              <w:spacing w:after="0"/>
+            </w:pPr>
+            <w:r>
+              <w:rPr>
+                <w:rFonts w:ascii="Calibri" w:cs="Calibri" w:eastAsia="Calibri" w:hAnsi="Calibri"/>
+                <w:b/>
+                <w:bCs/>
+                <w:color w:val="14181A"/>
+                <w:sz w:val="19"/>
+                <w:szCs w:val="19"/>
+              </w:rPr>
+              <w:t xml:space="preserve">Pulled pork</w:t>
+            </w:r>
+          </w:p>
+        </w:tc>
+        <w:tc>
+          <w:tcPr>
+            <w:tcW w:type="dxa" w:w="6300"/>
+            <w:tcMar>
+              <w:top w:type="dxa" w:w="60"/>
+              <w:left w:type="dxa" w:w="100"/>
+              <w:bottom w:type="dxa" w:w="60"/>
+              <w:right w:type="dxa" w:w="100"/>
+            </w:tcMar>
+          </w:tcPr>
+          <w:p>
+            <w:pPr>
+              <w:spacing w:after="0"/>
+            </w:pPr>
+            <w:r>
+              <w:rPr>
+                <w:rFonts w:ascii="Calibri" w:cs="Calibri" w:eastAsia="Calibri" w:hAnsi="Calibri"/>
+                <w:color w:val="14181A"/>
+                <w:sz w:val="18"/>
+                <w:szCs w:val="18"/>
+              </w:rPr>
+              <w:t xml:space="preserve">8 kg collar coloured hard, braised covered 150°C 5–6 h to 92–94°C. Rest 45 min in the liquor, pull, fold through the reduced sauce. Chill.</w:t>
+            </w:r>
+          </w:p>
+        </w:tc>
+        <w:tc>
+          <w:tcPr>
+            <w:tcW w:type="dxa" w:w="700"/>
+            <w:tcMar>
+              <w:top w:type="dxa" w:w="60"/>
+              <w:left w:type="dxa" w:w="100"/>
+              <w:bottom w:type="dxa" w:w="60"/>
+              <w:right w:type="dxa" w:w="100"/>
+            </w:tcMar>
+          </w:tcPr>
+          <w:p>
+            <w:pPr>
+              <w:spacing w:after="0"/>
+            </w:pPr>
+            <w:r>
+              <w:rPr>
+                <w:rFonts w:ascii="Calibri" w:cs="Calibri" w:eastAsia="Calibri" w:hAnsi="Calibri"/>
+                <w:color w:val="5C6560"/>
+                <w:sz w:val="22"/>
+                <w:szCs w:val="22"/>
+              </w:rPr>
+              <w:t xml:space="preserve">□</w:t>
+            </w:r>
+          </w:p>
+        </w:tc>
+      </w:tr>
+      <w:tr>
+        <w:tc>
+          <w:tcPr>
+            <w:tcW w:type="dxa" w:w="3000"/>
+            <w:tcMar>
+              <w:top w:type="dxa" w:w="60"/>
+              <w:left w:type="dxa" w:w="100"/>
+              <w:bottom w:type="dxa" w:w="60"/>
+              <w:right w:type="dxa" w:w="100"/>
+            </w:tcMar>
+          </w:tcPr>
+          <w:p>
+            <w:pPr>
+              <w:spacing w:after="0"/>
+            </w:pPr>
+            <w:r>
+              <w:rPr>
+                <w:rFonts w:ascii="Calibri" w:cs="Calibri" w:eastAsia="Calibri" w:hAnsi="Calibri"/>
+                <w:b/>
+                <w:bCs/>
+                <w:color w:val="14181A"/>
+                <w:sz w:val="19"/>
+                <w:szCs w:val="19"/>
+              </w:rPr>
+              <w:t xml:space="preserve">Crostini</w:t>
+            </w:r>
+          </w:p>
+        </w:tc>
+        <w:tc>
+          <w:tcPr>
+            <w:tcW w:type="dxa" w:w="6300"/>
+            <w:tcMar>
+              <w:top w:type="dxa" w:w="60"/>
+              <w:left w:type="dxa" w:w="100"/>
+              <w:bottom w:type="dxa" w:w="60"/>
+              <w:right w:type="dxa" w:w="100"/>
+            </w:tcMar>
+          </w:tcPr>
+          <w:p>
+            <w:pPr>
+              <w:spacing w:after="0"/>
+            </w:pPr>
+            <w:r>
+              <w:rPr>
+                <w:rFonts w:ascii="Calibri" w:cs="Calibri" w:eastAsia="Calibri" w:hAnsi="Calibri"/>
+                <w:color w:val="14181A"/>
+                <w:sz w:val="18"/>
+                <w:szCs w:val="18"/>
+              </w:rPr>
+              <w:t xml:space="preserve">Slice 14 baguettes on the bias at 1 cm — 330 slices. Fry, drain hard, COOL COMPLETELY, then airtight. Warm crostini boxed up go leathery overnight.</w:t>
+            </w:r>
+          </w:p>
+        </w:tc>
+        <w:tc>
+          <w:tcPr>
+            <w:tcW w:type="dxa" w:w="700"/>
+            <w:tcMar>
+              <w:top w:type="dxa" w:w="60"/>
+              <w:left w:type="dxa" w:w="100"/>
+              <w:bottom w:type="dxa" w:w="60"/>
+              <w:right w:type="dxa" w:w="100"/>
+            </w:tcMar>
+          </w:tcPr>
+          <w:p>
+            <w:pPr>
+              <w:spacing w:after="0"/>
+            </w:pPr>
+            <w:r>
+              <w:rPr>
+                <w:rFonts w:ascii="Calibri" w:cs="Calibri" w:eastAsia="Calibri" w:hAnsi="Calibri"/>
+                <w:color w:val="5C6560"/>
+                <w:sz w:val="22"/>
+                <w:szCs w:val="22"/>
+              </w:rPr>
+              <w:t xml:space="preserve">□</w:t>
+            </w:r>
+          </w:p>
+        </w:tc>
+      </w:tr>
+      <w:tr>
+        <w:tc>
+          <w:tcPr>
+            <w:tcW w:type="dxa" w:w="3000"/>
+            <w:tcMar>
+              <w:top w:type="dxa" w:w="60"/>
+              <w:left w:type="dxa" w:w="100"/>
+              <w:bottom w:type="dxa" w:w="60"/>
+              <w:right w:type="dxa" w:w="100"/>
+            </w:tcMar>
+          </w:tcPr>
+          <w:p>
+            <w:pPr>
+              <w:spacing w:after="0"/>
+            </w:pPr>
+            <w:r>
+              <w:rPr>
+                <w:rFonts w:ascii="Calibri" w:cs="Calibri" w:eastAsia="Calibri" w:hAnsi="Calibri"/>
+                <w:b/>
+                <w:bCs/>
+                <w:color w:val="14181A"/>
+                <w:sz w:val="19"/>
+                <w:szCs w:val="19"/>
+              </w:rPr>
+              <w:t xml:space="preserve">Crispy basil</w:t>
+            </w:r>
+          </w:p>
+        </w:tc>
+        <w:tc>
+          <w:tcPr>
+            <w:tcW w:type="dxa" w:w="6300"/>
+            <w:tcMar>
+              <w:top w:type="dxa" w:w="60"/>
+              <w:left w:type="dxa" w:w="100"/>
+              <w:bottom w:type="dxa" w:w="60"/>
+              <w:right w:type="dxa" w:w="100"/>
+            </w:tcMar>
+          </w:tcPr>
+          <w:p>
+            <w:pPr>
+              <w:spacing w:after="0"/>
+            </w:pPr>
+            <w:r>
+              <w:rPr>
+                <w:rFonts w:ascii="Calibri" w:cs="Calibri" w:eastAsia="Calibri" w:hAnsi="Calibri"/>
+                <w:color w:val="14181A"/>
+                <w:sz w:val="18"/>
+                <w:szCs w:val="18"/>
+              </w:rPr>
+              <w:t xml:space="preserve">Fry the leaves in seconds, straight onto paper, airtight once cold.</w:t>
+            </w:r>
+          </w:p>
+        </w:tc>
+        <w:tc>
+          <w:tcPr>
+            <w:tcW w:type="dxa" w:w="700"/>
+            <w:tcMar>
+              <w:top w:type="dxa" w:w="60"/>
+              <w:left w:type="dxa" w:w="100"/>
+              <w:bottom w:type="dxa" w:w="60"/>
+              <w:right w:type="dxa" w:w="100"/>
+            </w:tcMar>
+          </w:tcPr>
+          <w:p>
+            <w:pPr>
+              <w:spacing w:after="0"/>
+            </w:pPr>
+            <w:r>
+              <w:rPr>
+                <w:rFonts w:ascii="Calibri" w:cs="Calibri" w:eastAsia="Calibri" w:hAnsi="Calibri"/>
+                <w:color w:val="5C6560"/>
+                <w:sz w:val="22"/>
+                <w:szCs w:val="22"/>
+              </w:rPr>
+              <w:t xml:space="preserve">□</w:t>
+            </w:r>
+          </w:p>
+        </w:tc>
+      </w:tr>
+      <w:tr>
+        <w:tc>
+          <w:tcPr>
+            <w:tcW w:type="dxa" w:w="3000"/>
+            <w:tcMar>
+              <w:top w:type="dxa" w:w="60"/>
+              <w:left w:type="dxa" w:w="100"/>
+              <w:bottom w:type="dxa" w:w="60"/>
+              <w:right w:type="dxa" w:w="100"/>
+            </w:tcMar>
+          </w:tcPr>
+          <w:p>
+            <w:pPr>
+              <w:spacing w:after="0"/>
+            </w:pPr>
+            <w:r>
+              <w:rPr>
+                <w:rFonts w:ascii="Calibri" w:cs="Calibri" w:eastAsia="Calibri" w:hAnsi="Calibri"/>
+                <w:b/>
+                <w:bCs/>
+                <w:color w:val="14181A"/>
+                <w:sz w:val="19"/>
+                <w:szCs w:val="19"/>
+              </w:rPr>
+              <w:t xml:space="preserve">Croquettes</w:t>
+            </w:r>
+          </w:p>
+        </w:tc>
+        <w:tc>
+          <w:tcPr>
+            <w:tcW w:type="dxa" w:w="6300"/>
+            <w:tcMar>
+              <w:top w:type="dxa" w:w="60"/>
+              <w:left w:type="dxa" w:w="100"/>
+              <w:bottom w:type="dxa" w:w="60"/>
+              <w:right w:type="dxa" w:w="100"/>
+            </w:tcMar>
+          </w:tcPr>
+          <w:p>
+            <w:pPr>
+              <w:spacing w:after="0"/>
+            </w:pPr>
+            <w:r>
+              <w:rPr>
+                <w:rFonts w:ascii="Calibri" w:cs="Calibri" w:eastAsia="Calibri" w:hAnsi="Calibri"/>
+                <w:color w:val="14181A"/>
+                <w:sz w:val="18"/>
+                <w:szCs w:val="18"/>
+              </w:rPr>
+              <w:t xml:space="preserve">Cut and roll the chilled mix at ~30 g × 300. Flour, egg, crumb — double crumb any that look thin. Tray and chill.</w:t>
+            </w:r>
+          </w:p>
+        </w:tc>
+        <w:tc>
+          <w:tcPr>
+            <w:tcW w:type="dxa" w:w="700"/>
+            <w:tcMar>
+              <w:top w:type="dxa" w:w="60"/>
+              <w:left w:type="dxa" w:w="100"/>
+              <w:bottom w:type="dxa" w:w="60"/>
+              <w:right w:type="dxa" w:w="100"/>
+            </w:tcMar>
+          </w:tcPr>
+          <w:p>
+            <w:pPr>
+              <w:spacing w:after="0"/>
+            </w:pPr>
+            <w:r>
+              <w:rPr>
+                <w:rFonts w:ascii="Calibri" w:cs="Calibri" w:eastAsia="Calibri" w:hAnsi="Calibri"/>
+                <w:color w:val="5C6560"/>
+                <w:sz w:val="22"/>
+                <w:szCs w:val="22"/>
+              </w:rPr>
+              <w:t xml:space="preserve">□</w:t>
+            </w:r>
+          </w:p>
+        </w:tc>
+      </w:tr>
+      <w:tr>
+        <w:tc>
+          <w:tcPr>
+            <w:tcW w:type="dxa" w:w="3000"/>
+            <w:tcMar>
+              <w:top w:type="dxa" w:w="60"/>
+              <w:left w:type="dxa" w:w="100"/>
+              <w:bottom w:type="dxa" w:w="60"/>
+              <w:right w:type="dxa" w:w="100"/>
+            </w:tcMar>
+          </w:tcPr>
+          <w:p>
+            <w:pPr>
+              <w:spacing w:after="0"/>
+            </w:pPr>
+            <w:r>
+              <w:rPr>
+                <w:rFonts w:ascii="Calibri" w:cs="Calibri" w:eastAsia="Calibri" w:hAnsi="Calibri"/>
+                <w:b/>
+                <w:bCs/>
+                <w:color w:val="14181A"/>
+                <w:sz w:val="19"/>
+                <w:szCs w:val="19"/>
+              </w:rPr>
+              <w:t xml:space="preserve">Bombas</w:t>
+            </w:r>
+          </w:p>
+        </w:tc>
+        <w:tc>
+          <w:tcPr>
+            <w:tcW w:type="dxa" w:w="6300"/>
+            <w:tcMar>
+              <w:top w:type="dxa" w:w="60"/>
+              <w:left w:type="dxa" w:w="100"/>
+              <w:bottom w:type="dxa" w:w="60"/>
+              <w:right w:type="dxa" w:w="100"/>
+            </w:tcMar>
+          </w:tcPr>
+          <w:p>
+            <w:pPr>
+              <w:spacing w:after="0"/>
+            </w:pPr>
+            <w:r>
+              <w:rPr>
+                <w:rFonts w:ascii="Calibri" w:cs="Calibri" w:eastAsia="Calibri" w:hAnsi="Calibri"/>
+                <w:color w:val="14181A"/>
+                <w:sz w:val="18"/>
+                <w:szCs w:val="18"/>
+              </w:rPr>
+              <w:t xml:space="preserve">Roll 7.5 kg goats cheese at 25 g × 300. Flour, egg, panko, double crumb. FREEZE SOLID — from chilled they burst in the fryer.</w:t>
+            </w:r>
+          </w:p>
+        </w:tc>
+        <w:tc>
+          <w:tcPr>
+            <w:tcW w:type="dxa" w:w="700"/>
+            <w:tcMar>
+              <w:top w:type="dxa" w:w="60"/>
+              <w:left w:type="dxa" w:w="100"/>
+              <w:bottom w:type="dxa" w:w="60"/>
+              <w:right w:type="dxa" w:w="100"/>
+            </w:tcMar>
+          </w:tcPr>
+          <w:p>
+            <w:pPr>
+              <w:spacing w:after="0"/>
+            </w:pPr>
+            <w:r>
+              <w:rPr>
+                <w:rFonts w:ascii="Calibri" w:cs="Calibri" w:eastAsia="Calibri" w:hAnsi="Calibri"/>
+                <w:color w:val="5C6560"/>
+                <w:sz w:val="22"/>
+                <w:szCs w:val="22"/>
+              </w:rPr>
+              <w:t xml:space="preserve">□</w:t>
+            </w:r>
+          </w:p>
+        </w:tc>
+      </w:tr>
+      <w:tr>
+        <w:tc>
+          <w:tcPr>
+            <w:tcW w:type="dxa" w:w="3000"/>
+            <w:tcMar>
+              <w:top w:type="dxa" w:w="60"/>
+              <w:left w:type="dxa" w:w="100"/>
+              <w:bottom w:type="dxa" w:w="60"/>
+              <w:right w:type="dxa" w:w="100"/>
+            </w:tcMar>
+          </w:tcPr>
+          <w:p>
+            <w:pPr>
+              <w:spacing w:after="0"/>
+            </w:pPr>
+            <w:r>
+              <w:rPr>
+                <w:rFonts w:ascii="Calibri" w:cs="Calibri" w:eastAsia="Calibri" w:hAnsi="Calibri"/>
+                <w:b/>
+                <w:bCs/>
+                <w:color w:val="14181A"/>
+                <w:sz w:val="19"/>
+                <w:szCs w:val="19"/>
+              </w:rPr>
+              <w:t xml:space="preserve">Cut the hash</w:t>
+            </w:r>
+          </w:p>
+        </w:tc>
+        <w:tc>
+          <w:tcPr>
+            <w:tcW w:type="dxa" w:w="6300"/>
+            <w:tcMar>
+              <w:top w:type="dxa" w:w="60"/>
+              <w:left w:type="dxa" w:w="100"/>
+              <w:bottom w:type="dxa" w:w="60"/>
+              <w:right w:type="dxa" w:w="100"/>
+            </w:tcMar>
+          </w:tcPr>
+          <w:p>
+            <w:pPr>
+              <w:spacing w:after="0"/>
+            </w:pPr>
+            <w:r>
+              <w:rPr>
+                <w:rFonts w:ascii="Calibri" w:cs="Calibri" w:eastAsia="Calibri" w:hAnsi="Calibri"/>
+                <w:color w:val="14181A"/>
+                <w:sz w:val="18"/>
+                <w:szCs w:val="18"/>
+              </w:rPr>
+              <w:t xml:space="preserve">Cut the pressed trays cold into 300 pieces. Keep the trim back for the team.</w:t>
+            </w:r>
+          </w:p>
+        </w:tc>
+        <w:tc>
+          <w:tcPr>
+            <w:tcW w:type="dxa" w:w="700"/>
+            <w:tcMar>
+              <w:top w:type="dxa" w:w="60"/>
+              <w:left w:type="dxa" w:w="100"/>
+              <w:bottom w:type="dxa" w:w="60"/>
+              <w:right w:type="dxa" w:w="100"/>
+            </w:tcMar>
+          </w:tcPr>
+          <w:p>
+            <w:pPr>
+              <w:spacing w:after="0"/>
+            </w:pPr>
+            <w:r>
+              <w:rPr>
+                <w:rFonts w:ascii="Calibri" w:cs="Calibri" w:eastAsia="Calibri" w:hAnsi="Calibri"/>
+                <w:color w:val="5C6560"/>
+                <w:sz w:val="22"/>
+                <w:szCs w:val="22"/>
+              </w:rPr>
+              <w:t xml:space="preserve">□</w:t>
+            </w:r>
+          </w:p>
+        </w:tc>
+      </w:tr>
+      <w:tr>
+        <w:tc>
+          <w:tcPr>
+            <w:tcW w:type="dxa" w:w="3000"/>
+            <w:tcMar>
+              <w:top w:type="dxa" w:w="60"/>
+              <w:left w:type="dxa" w:w="100"/>
+              <w:bottom w:type="dxa" w:w="60"/>
+              <w:right w:type="dxa" w:w="100"/>
+            </w:tcMar>
+          </w:tcPr>
+          <w:p>
+            <w:pPr>
+              <w:spacing w:after="0"/>
+            </w:pPr>
+            <w:r>
+              <w:rPr>
+                <w:rFonts w:ascii="Calibri" w:cs="Calibri" w:eastAsia="Calibri" w:hAnsi="Calibri"/>
+                <w:b/>
+                <w:bCs/>
+                <w:color w:val="14181A"/>
+                <w:sz w:val="19"/>
+                <w:szCs w:val="19"/>
+              </w:rPr>
+              <w:t xml:space="preserve">Anchovy aioli</w:t>
+            </w:r>
+          </w:p>
+        </w:tc>
+        <w:tc>
+          <w:tcPr>
+            <w:tcW w:type="dxa" w:w="6300"/>
+            <w:tcMar>
+              <w:top w:type="dxa" w:w="60"/>
+              <w:left w:type="dxa" w:w="100"/>
+              <w:bottom w:type="dxa" w:w="60"/>
+              <w:right w:type="dxa" w:w="100"/>
+            </w:tcMar>
+          </w:tcPr>
+          <w:p>
+            <w:pPr>
+              <w:spacing w:after="0"/>
+            </w:pPr>
+            <w:r>
+              <w:rPr>
+                <w:rFonts w:ascii="Calibri" w:cs="Calibri" w:eastAsia="Calibri" w:hAnsi="Calibri"/>
+                <w:color w:val="14181A"/>
+                <w:sz w:val="18"/>
+                <w:szCs w:val="18"/>
+              </w:rPr>
+              <w:t xml:space="preserve">Quarter batch, 1.4 L. Pasteurised yolk, oil streamed slowly, spare yolk to hand.</w:t>
+            </w:r>
+          </w:p>
+        </w:tc>
+        <w:tc>
+          <w:tcPr>
+            <w:tcW w:type="dxa" w:w="700"/>
+            <w:tcMar>
+              <w:top w:type="dxa" w:w="60"/>
+              <w:left w:type="dxa" w:w="100"/>
+              <w:bottom w:type="dxa" w:w="60"/>
+              <w:right w:type="dxa" w:w="100"/>
+            </w:tcMar>
+          </w:tcPr>
+          <w:p>
+            <w:pPr>
+              <w:spacing w:after="0"/>
+            </w:pPr>
+            <w:r>
+              <w:rPr>
+                <w:rFonts w:ascii="Calibri" w:cs="Calibri" w:eastAsia="Calibri" w:hAnsi="Calibri"/>
+                <w:color w:val="5C6560"/>
+                <w:sz w:val="22"/>
+                <w:szCs w:val="22"/>
+              </w:rPr>
+              <w:t xml:space="preserve">□</w:t>
+            </w:r>
+          </w:p>
+        </w:tc>
+      </w:tr>
+      <w:tr>
+        <w:tc>
+          <w:tcPr>
+            <w:tcW w:type="dxa" w:w="3000"/>
+            <w:tcMar>
+              <w:top w:type="dxa" w:w="60"/>
+              <w:left w:type="dxa" w:w="100"/>
+              <w:bottom w:type="dxa" w:w="60"/>
+              <w:right w:type="dxa" w:w="100"/>
+            </w:tcMar>
+          </w:tcPr>
+          <w:p>
+            <w:pPr>
+              <w:spacing w:after="0"/>
+            </w:pPr>
+            <w:r>
+              <w:rPr>
+                <w:rFonts w:ascii="Calibri" w:cs="Calibri" w:eastAsia="Calibri" w:hAnsi="Calibri"/>
+                <w:b/>
+                <w:bCs/>
+                <w:color w:val="14181A"/>
+                <w:sz w:val="19"/>
+                <w:szCs w:val="19"/>
+              </w:rPr>
+              <w:t xml:space="preserve">Miso aioli</w:t>
+            </w:r>
+          </w:p>
+        </w:tc>
+        <w:tc>
+          <w:tcPr>
+            <w:tcW w:type="dxa" w:w="6300"/>
+            <w:tcMar>
+              <w:top w:type="dxa" w:w="60"/>
+              <w:left w:type="dxa" w:w="100"/>
+              <w:bottom w:type="dxa" w:w="60"/>
+              <w:right w:type="dxa" w:w="100"/>
+            </w:tcMar>
+          </w:tcPr>
+          <w:p>
+            <w:pPr>
+              <w:spacing w:after="0"/>
+            </w:pPr>
+            <w:r>
+              <w:rPr>
+                <w:rFonts w:ascii="Calibri" w:cs="Calibri" w:eastAsia="Calibri" w:hAnsi="Calibri"/>
+                <w:color w:val="14181A"/>
+                <w:sz w:val="18"/>
+                <w:szCs w:val="18"/>
+              </w:rPr>
+              <w:t xml:space="preserve">1.1 L. Loosen the miso in the vinegar first, keep it tighter than the anchovy one.</w:t>
+            </w:r>
+          </w:p>
+        </w:tc>
+        <w:tc>
+          <w:tcPr>
+            <w:tcW w:type="dxa" w:w="700"/>
+            <w:tcMar>
+              <w:top w:type="dxa" w:w="60"/>
+              <w:left w:type="dxa" w:w="100"/>
+              <w:bottom w:type="dxa" w:w="60"/>
+              <w:right w:type="dxa" w:w="100"/>
+            </w:tcMar>
+          </w:tcPr>
+          <w:p>
+            <w:pPr>
+              <w:spacing w:after="0"/>
+            </w:pPr>
+            <w:r>
+              <w:rPr>
+                <w:rFonts w:ascii="Calibri" w:cs="Calibri" w:eastAsia="Calibri" w:hAnsi="Calibri"/>
+                <w:color w:val="5C6560"/>
+                <w:sz w:val="22"/>
+                <w:szCs w:val="22"/>
+              </w:rPr>
+              <w:t xml:space="preserve">□</w:t>
+            </w:r>
+          </w:p>
+        </w:tc>
+      </w:tr>
+      <w:tr>
+        <w:tc>
+          <w:tcPr>
+            <w:tcW w:type="dxa" w:w="3000"/>
+            <w:tcMar>
+              <w:top w:type="dxa" w:w="60"/>
+              <w:left w:type="dxa" w:w="100"/>
+              <w:bottom w:type="dxa" w:w="60"/>
+              <w:right w:type="dxa" w:w="100"/>
+            </w:tcMar>
+          </w:tcPr>
+          <w:p>
+            <w:pPr>
+              <w:spacing w:after="0"/>
+            </w:pPr>
+            <w:r>
+              <w:rPr>
+                <w:rFonts w:ascii="Calibri" w:cs="Calibri" w:eastAsia="Calibri" w:hAnsi="Calibri"/>
+                <w:b/>
+                <w:bCs/>
+                <w:color w:val="14181A"/>
+                <w:sz w:val="19"/>
+                <w:szCs w:val="19"/>
+              </w:rPr>
+              <w:t xml:space="preserve">Slaw dressing</w:t>
+            </w:r>
+          </w:p>
+        </w:tc>
+        <w:tc>
+          <w:tcPr>
+            <w:tcW w:type="dxa" w:w="6300"/>
+            <w:tcMar>
+              <w:top w:type="dxa" w:w="60"/>
+              <w:left w:type="dxa" w:w="100"/>
+              <w:bottom w:type="dxa" w:w="60"/>
+              <w:right w:type="dxa" w:w="100"/>
+            </w:tcMar>
+          </w:tcPr>
+          <w:p>
+            <w:pPr>
+              <w:spacing w:after="0"/>
+            </w:pPr>
+            <w:r>
+              <w:rPr>
+                <w:rFonts w:ascii="Calibri" w:cs="Calibri" w:eastAsia="Calibri" w:hAnsi="Calibri"/>
+                <w:color w:val="14181A"/>
+                <w:sz w:val="18"/>
+                <w:szCs w:val="18"/>
+              </w:rPr>
+              <w:t xml:space="preserve">Make the dressing only — vinegar, honey, aromatics, sesame oil last. Do NOT dress the slaw.</w:t>
+            </w:r>
+          </w:p>
+        </w:tc>
+        <w:tc>
+          <w:tcPr>
+            <w:tcW w:type="dxa" w:w="700"/>
+            <w:tcMar>
+              <w:top w:type="dxa" w:w="60"/>
+              <w:left w:type="dxa" w:w="100"/>
+              <w:bottom w:type="dxa" w:w="60"/>
+              <w:right w:type="dxa" w:w="100"/>
+            </w:tcMar>
+          </w:tcPr>
+          <w:p>
+            <w:pPr>
+              <w:spacing w:after="0"/>
+            </w:pPr>
+            <w:r>
+              <w:rPr>
+                <w:rFonts w:ascii="Calibri" w:cs="Calibri" w:eastAsia="Calibri" w:hAnsi="Calibri"/>
+                <w:color w:val="5C6560"/>
+                <w:sz w:val="22"/>
+                <w:szCs w:val="22"/>
+              </w:rPr>
+              <w:t xml:space="preserve">□</w:t>
+            </w:r>
+          </w:p>
+        </w:tc>
+      </w:tr>
+      <w:tr>
+        <w:tc>
+          <w:tcPr>
+            <w:tcW w:type="dxa" w:w="3000"/>
+            <w:tcMar>
+              <w:top w:type="dxa" w:w="60"/>
+              <w:left w:type="dxa" w:w="100"/>
+              <w:bottom w:type="dxa" w:w="60"/>
+              <w:right w:type="dxa" w:w="100"/>
+            </w:tcMar>
+          </w:tcPr>
+          <w:p>
+            <w:pPr>
+              <w:spacing w:after="0"/>
+            </w:pPr>
+            <w:r>
+              <w:rPr>
+                <w:rFonts w:ascii="Calibri" w:cs="Calibri" w:eastAsia="Calibri" w:hAnsi="Calibri"/>
+                <w:b/>
+                <w:bCs/>
+                <w:color w:val="14181A"/>
+                <w:sz w:val="19"/>
+                <w:szCs w:val="19"/>
+              </w:rPr>
+              <w:t xml:space="preserve">Pack and label</w:t>
+            </w:r>
+          </w:p>
+        </w:tc>
+        <w:tc>
+          <w:tcPr>
+            <w:tcW w:type="dxa" w:w="6300"/>
+            <w:tcMar>
+              <w:top w:type="dxa" w:w="60"/>
+              <w:left w:type="dxa" w:w="100"/>
+              <w:bottom w:type="dxa" w:w="60"/>
+              <w:right w:type="dxa" w:w="100"/>
+            </w:tcMar>
+          </w:tcPr>
+          <w:p>
+            <w:pPr>
+              <w:spacing w:after="0"/>
+            </w:pPr>
+            <w:r>
+              <w:rPr>
+                <w:rFonts w:ascii="Calibri" w:cs="Calibri" w:eastAsia="Calibri" w:hAnsi="Calibri"/>
+                <w:color w:val="14181A"/>
+                <w:sz w:val="18"/>
+                <w:szCs w:val="18"/>
+              </w:rPr>
+              <w:t xml:space="preserve">Everything boxed, labelled and on the transport list. Fryer oil, piping bags, nozzles, trays, boards, napkins.</w:t>
+            </w:r>
+          </w:p>
+        </w:tc>
+        <w:tc>
+          <w:tcPr>
+            <w:tcW w:type="dxa" w:w="700"/>
+            <w:tcMar>
+              <w:top w:type="dxa" w:w="60"/>
+              <w:left w:type="dxa" w:w="100"/>
+              <w:bottom w:type="dxa" w:w="60"/>
+              <w:right w:type="dxa" w:w="100"/>
+            </w:tcMar>
+          </w:tcPr>
+          <w:p>
+            <w:pPr>
+              <w:spacing w:after="0"/>
+            </w:pPr>
+            <w:r>
+              <w:rPr>
+                <w:rFonts w:ascii="Calibri" w:cs="Calibri" w:eastAsia="Calibri" w:hAnsi="Calibri"/>
+                <w:color w:val="5C6560"/>
+                <w:sz w:val="22"/>
+                <w:szCs w:val="22"/>
+              </w:rPr>
+              <w:t xml:space="preserve">□</w:t>
+            </w:r>
+          </w:p>
+        </w:tc>
+      </w:tr>
+    </w:tbl>
+    <w:p>
+      <w:pPr>
+        <w:spacing w:after="80" w:before="0"/>
+      </w:pPr>
+      <w:r>
+        <w:rPr>
+          <w:rFonts w:ascii="Calibri" w:cs="Calibri" w:eastAsia="Calibri" w:hAnsi="Calibri"/>
+          <w:color w:val="14181A"/>
+          <w:sz w:val="20"/>
+          <w:szCs w:val="20"/>
+        </w:rPr>
+        <w:t xml:space="preserve"/>
+      </w:r>
+    </w:p>
+    <w:p>
+      <w:pPr>
+        <w:pStyle w:val="Heading2"/>
+        <w:spacing w:after="120" w:before="260"/>
+      </w:pPr>
+      <w:r>
+        <w:t xml:space="preserve">Wednesday 9 September — service</w:t>
+      </w:r>
+    </w:p>
+    <w:tbl>
+      <w:tblPr>
+        <w:tblW w:type="dxa" w:w="10000"/>
+        <w:tblBorders>
+          <w:top w:val="single" w:color="BFC6BA" w:sz="2"/>
+          <w:left w:val="none"/>
+          <w:bottom w:val="single" w:color="BFC6BA" w:sz="2"/>
+          <w:right w:val="none"/>
+          <w:insideH w:val="single" w:color="BFC6BA" w:sz="2"/>
+          <w:insideV w:val="none"/>
+        </w:tblBorders>
+      </w:tblPr>
+      <w:tblGrid>
+        <w:gridCol w:w="3000"/>
+        <w:gridCol w:w="6300"/>
+        <w:gridCol w:w="700"/>
+      </w:tblGrid>
+      <w:tr>
+        <w:trPr>
+          <w:tblHeader/>
+        </w:trPr>
+        <w:tc>
+          <w:tcPr>
+            <w:tcW w:type="dxa" w:w="3000"/>
+            <w:shd w:fill="E6E8E2" w:color="auto" w:val="clear"/>
+            <w:tcMar>
+              <w:top w:type="dxa" w:w="60"/>
+              <w:left w:type="dxa" w:w="100"/>
+              <w:bottom w:type="dxa" w:w="60"/>
+              <w:right w:type="dxa" w:w="100"/>
+            </w:tcMar>
+          </w:tcPr>
+          <w:p>
+            <w:pPr>
+              <w:spacing w:after="0"/>
+            </w:pPr>
+            <w:r>
+              <w:rPr>
+                <w:rFonts w:ascii="Calibri" w:cs="Calibri" w:eastAsia="Calibri" w:hAnsi="Calibri"/>
+                <w:b/>
+                <w:bCs/>
+                <w:color w:val="14181A"/>
+                <w:sz w:val="19"/>
+                <w:szCs w:val="19"/>
+              </w:rPr>
+              <w:t xml:space="preserve">Task</w:t>
+            </w:r>
+          </w:p>
+        </w:tc>
+        <w:tc>
+          <w:tcPr>
+            <w:tcW w:type="dxa" w:w="6300"/>
+            <w:shd w:fill="E6E8E2" w:color="auto" w:val="clear"/>
+            <w:tcMar>
+              <w:top w:type="dxa" w:w="60"/>
+              <w:left w:type="dxa" w:w="100"/>
+              <w:bottom w:type="dxa" w:w="60"/>
+              <w:right w:type="dxa" w:w="100"/>
+            </w:tcMar>
+          </w:tcPr>
+          <w:p>
+            <w:pPr>
+              <w:spacing w:after="0"/>
+            </w:pPr>
+            <w:r>
+              <w:rPr>
+                <w:rFonts w:ascii="Calibri" w:cs="Calibri" w:eastAsia="Calibri" w:hAnsi="Calibri"/>
+                <w:b/>
+                <w:bCs/>
+                <w:color w:val="14181A"/>
+                <w:sz w:val="19"/>
+                <w:szCs w:val="19"/>
+              </w:rPr>
+              <w:t xml:space="preserve">What it involves</w:t>
+            </w:r>
+          </w:p>
+        </w:tc>
+        <w:tc>
+          <w:tcPr>
+            <w:tcW w:type="dxa" w:w="700"/>
+            <w:shd w:fill="E6E8E2" w:color="auto" w:val="clear"/>
+            <w:tcMar>
+              <w:top w:type="dxa" w:w="60"/>
+              <w:left w:type="dxa" w:w="100"/>
+              <w:bottom w:type="dxa" w:w="60"/>
+              <w:right w:type="dxa" w:w="100"/>
+            </w:tcMar>
+          </w:tcPr>
+          <w:p>
+            <w:pPr>
+              <w:spacing w:after="0"/>
+            </w:pPr>
+            <w:r>
+              <w:rPr>
+                <w:rFonts w:ascii="Calibri" w:cs="Calibri" w:eastAsia="Calibri" w:hAnsi="Calibri"/>
+                <w:b/>
+                <w:bCs/>
+                <w:color w:val="14181A"/>
+                <w:sz w:val="16"/>
+                <w:szCs w:val="16"/>
+              </w:rPr>
+              <w:t xml:space="preserve">Done</w:t>
+            </w:r>
+          </w:p>
+        </w:tc>
+      </w:tr>
+      <w:tr>
+        <w:tc>
+          <w:tcPr>
+            <w:tcW w:type="dxa" w:w="3000"/>
+            <w:tcMar>
+              <w:top w:type="dxa" w:w="60"/>
+              <w:left w:type="dxa" w:w="100"/>
+              <w:bottom w:type="dxa" w:w="60"/>
+              <w:right w:type="dxa" w:w="100"/>
+            </w:tcMar>
+          </w:tcPr>
+          <w:p>
+            <w:pPr>
+              <w:spacing w:after="0"/>
+            </w:pPr>
+            <w:r>
+              <w:rPr>
+                <w:rFonts w:ascii="Calibri" w:cs="Calibri" w:eastAsia="Calibri" w:hAnsi="Calibri"/>
+                <w:b/>
+                <w:bCs/>
+                <w:color w:val="14181A"/>
+                <w:sz w:val="19"/>
+                <w:szCs w:val="19"/>
+              </w:rPr>
+              <w:t xml:space="preserve">Tomatoes</w:t>
+            </w:r>
+          </w:p>
+        </w:tc>
+        <w:tc>
+          <w:tcPr>
+            <w:tcW w:type="dxa" w:w="6300"/>
+            <w:tcMar>
+              <w:top w:type="dxa" w:w="60"/>
+              <w:left w:type="dxa" w:w="100"/>
+              <w:bottom w:type="dxa" w:w="60"/>
+              <w:right w:type="dxa" w:w="100"/>
+            </w:tcMar>
+          </w:tcPr>
+          <w:p>
+            <w:pPr>
+              <w:spacing w:after="0"/>
+            </w:pPr>
+            <w:r>
+              <w:rPr>
+                <w:rFonts w:ascii="Calibri" w:cs="Calibri" w:eastAsia="Calibri" w:hAnsi="Calibri"/>
+                <w:color w:val="14181A"/>
+                <w:sz w:val="18"/>
+                <w:szCs w:val="18"/>
+              </w:rPr>
+              <w:t xml:space="preserve">Slice 4 mm, lay out on paper. Season only as they go on — salted early they weep through the crostini.</w:t>
+            </w:r>
+          </w:p>
+        </w:tc>
+        <w:tc>
+          <w:tcPr>
+            <w:tcW w:type="dxa" w:w="700"/>
+            <w:tcMar>
+              <w:top w:type="dxa" w:w="60"/>
+              <w:left w:type="dxa" w:w="100"/>
+              <w:bottom w:type="dxa" w:w="60"/>
+              <w:right w:type="dxa" w:w="100"/>
+            </w:tcMar>
+          </w:tcPr>
+          <w:p>
+            <w:pPr>
+              <w:spacing w:after="0"/>
+            </w:pPr>
+            <w:r>
+              <w:rPr>
+                <w:rFonts w:ascii="Calibri" w:cs="Calibri" w:eastAsia="Calibri" w:hAnsi="Calibri"/>
+                <w:color w:val="5C6560"/>
+                <w:sz w:val="22"/>
+                <w:szCs w:val="22"/>
+              </w:rPr>
+              <w:t xml:space="preserve">□</w:t>
+            </w:r>
+          </w:p>
+        </w:tc>
+      </w:tr>
+      <w:tr>
+        <w:tc>
+          <w:tcPr>
+            <w:tcW w:type="dxa" w:w="3000"/>
+            <w:tcMar>
+              <w:top w:type="dxa" w:w="60"/>
+              <w:left w:type="dxa" w:w="100"/>
+              <w:bottom w:type="dxa" w:w="60"/>
+              <w:right w:type="dxa" w:w="100"/>
+            </w:tcMar>
+          </w:tcPr>
+          <w:p>
+            <w:pPr>
+              <w:spacing w:after="0"/>
+            </w:pPr>
+            <w:r>
+              <w:rPr>
+                <w:rFonts w:ascii="Calibri" w:cs="Calibri" w:eastAsia="Calibri" w:hAnsi="Calibri"/>
+                <w:b/>
+                <w:bCs/>
+                <w:color w:val="14181A"/>
+                <w:sz w:val="19"/>
+                <w:szCs w:val="19"/>
+              </w:rPr>
+              <w:t xml:space="preserve">Dress the slaw</w:t>
+            </w:r>
+          </w:p>
+        </w:tc>
+        <w:tc>
+          <w:tcPr>
+            <w:tcW w:type="dxa" w:w="6300"/>
+            <w:tcMar>
+              <w:top w:type="dxa" w:w="60"/>
+              <w:left w:type="dxa" w:w="100"/>
+              <w:bottom w:type="dxa" w:w="60"/>
+              <w:right w:type="dxa" w:w="100"/>
+            </w:tcMar>
+          </w:tcPr>
+          <w:p>
+            <w:pPr>
+              <w:spacing w:after="0"/>
+            </w:pPr>
+            <w:r>
+              <w:rPr>
+                <w:rFonts w:ascii="Calibri" w:cs="Calibri" w:eastAsia="Calibri" w:hAnsi="Calibri"/>
+                <w:color w:val="14181A"/>
+                <w:sz w:val="18"/>
+                <w:szCs w:val="18"/>
+              </w:rPr>
+              <w:t xml:space="preserve">30 minutes before service, no earlier.</w:t>
+            </w:r>
+          </w:p>
+        </w:tc>
+        <w:tc>
+          <w:tcPr>
+            <w:tcW w:type="dxa" w:w="700"/>
+            <w:tcMar>
+              <w:top w:type="dxa" w:w="60"/>
+              <w:left w:type="dxa" w:w="100"/>
+              <w:bottom w:type="dxa" w:w="60"/>
+              <w:right w:type="dxa" w:w="100"/>
+            </w:tcMar>
+          </w:tcPr>
+          <w:p>
+            <w:pPr>
+              <w:spacing w:after="0"/>
+            </w:pPr>
+            <w:r>
+              <w:rPr>
+                <w:rFonts w:ascii="Calibri" w:cs="Calibri" w:eastAsia="Calibri" w:hAnsi="Calibri"/>
+                <w:color w:val="5C6560"/>
+                <w:sz w:val="22"/>
+                <w:szCs w:val="22"/>
+              </w:rPr>
+              <w:t xml:space="preserve">□</w:t>
+            </w:r>
+          </w:p>
+        </w:tc>
+      </w:tr>
+      <w:tr>
+        <w:tc>
+          <w:tcPr>
+            <w:tcW w:type="dxa" w:w="3000"/>
+            <w:tcMar>
+              <w:top w:type="dxa" w:w="60"/>
+              <w:left w:type="dxa" w:w="100"/>
+              <w:bottom w:type="dxa" w:w="60"/>
+              <w:right w:type="dxa" w:w="100"/>
+            </w:tcMar>
+          </w:tcPr>
+          <w:p>
+            <w:pPr>
+              <w:spacing w:after="0"/>
+            </w:pPr>
+            <w:r>
+              <w:rPr>
+                <w:rFonts w:ascii="Calibri" w:cs="Calibri" w:eastAsia="Calibri" w:hAnsi="Calibri"/>
+                <w:b/>
+                <w:bCs/>
+                <w:color w:val="14181A"/>
+                <w:sz w:val="19"/>
+                <w:szCs w:val="19"/>
+              </w:rPr>
+              <w:t xml:space="preserve">Set the fryers</w:t>
+            </w:r>
+          </w:p>
+        </w:tc>
+        <w:tc>
+          <w:tcPr>
+            <w:tcW w:type="dxa" w:w="6300"/>
+            <w:tcMar>
+              <w:top w:type="dxa" w:w="60"/>
+              <w:left w:type="dxa" w:w="100"/>
+              <w:bottom w:type="dxa" w:w="60"/>
+              <w:right w:type="dxa" w:w="100"/>
+            </w:tcMar>
+          </w:tcPr>
+          <w:p>
+            <w:pPr>
+              <w:spacing w:after="0"/>
+            </w:pPr>
+            <w:r>
+              <w:rPr>
+                <w:rFonts w:ascii="Calibri" w:cs="Calibri" w:eastAsia="Calibri" w:hAnsi="Calibri"/>
+                <w:color w:val="14181A"/>
+                <w:sz w:val="18"/>
+                <w:szCs w:val="18"/>
+              </w:rPr>
+              <w:t xml:space="preserve">Croquettes 170°C · bombas 180°C from frozen · hash crisped in a hot pan or the fryer.</w:t>
+            </w:r>
+          </w:p>
+        </w:tc>
+        <w:tc>
+          <w:tcPr>
+            <w:tcW w:type="dxa" w:w="700"/>
+            <w:tcMar>
+              <w:top w:type="dxa" w:w="60"/>
+              <w:left w:type="dxa" w:w="100"/>
+              <w:bottom w:type="dxa" w:w="60"/>
+              <w:right w:type="dxa" w:w="100"/>
+            </w:tcMar>
+          </w:tcPr>
+          <w:p>
+            <w:pPr>
+              <w:spacing w:after="0"/>
+            </w:pPr>
+            <w:r>
+              <w:rPr>
+                <w:rFonts w:ascii="Calibri" w:cs="Calibri" w:eastAsia="Calibri" w:hAnsi="Calibri"/>
+                <w:color w:val="5C6560"/>
+                <w:sz w:val="22"/>
+                <w:szCs w:val="22"/>
+              </w:rPr>
+              <w:t xml:space="preserve">□</w:t>
+            </w:r>
+          </w:p>
+        </w:tc>
+      </w:tr>
+      <w:tr>
+        <w:tc>
+          <w:tcPr>
+            <w:tcW w:type="dxa" w:w="3000"/>
+            <w:tcMar>
+              <w:top w:type="dxa" w:w="60"/>
+              <w:left w:type="dxa" w:w="100"/>
+              <w:bottom w:type="dxa" w:w="60"/>
+              <w:right w:type="dxa" w:w="100"/>
+            </w:tcMar>
+          </w:tcPr>
+          <w:p>
+            <w:pPr>
+              <w:spacing w:after="0"/>
+            </w:pPr>
+            <w:r>
+              <w:rPr>
+                <w:rFonts w:ascii="Calibri" w:cs="Calibri" w:eastAsia="Calibri" w:hAnsi="Calibri"/>
+                <w:b/>
+                <w:bCs/>
+                <w:color w:val="14181A"/>
+                <w:sz w:val="19"/>
+                <w:szCs w:val="19"/>
+              </w:rPr>
+              <w:t xml:space="preserve">Reheat</w:t>
+            </w:r>
+          </w:p>
+        </w:tc>
+        <w:tc>
+          <w:tcPr>
+            <w:tcW w:type="dxa" w:w="6300"/>
+            <w:tcMar>
+              <w:top w:type="dxa" w:w="60"/>
+              <w:left w:type="dxa" w:w="100"/>
+              <w:bottom w:type="dxa" w:w="60"/>
+              <w:right w:type="dxa" w:w="100"/>
+            </w:tcMar>
+          </w:tcPr>
+          <w:p>
+            <w:pPr>
+              <w:spacing w:after="0"/>
+            </w:pPr>
+            <w:r>
+              <w:rPr>
+                <w:rFonts w:ascii="Calibri" w:cs="Calibri" w:eastAsia="Calibri" w:hAnsi="Calibri"/>
+                <w:color w:val="14181A"/>
+                <w:sz w:val="18"/>
+                <w:szCs w:val="18"/>
+              </w:rPr>
+              <w:t xml:space="preserve">Pulled pork up to temperature, hot honey warm enough to drizzle rather than drag.</w:t>
+            </w:r>
+          </w:p>
+        </w:tc>
+        <w:tc>
+          <w:tcPr>
+            <w:tcW w:type="dxa" w:w="700"/>
+            <w:tcMar>
+              <w:top w:type="dxa" w:w="60"/>
+              <w:left w:type="dxa" w:w="100"/>
+              <w:bottom w:type="dxa" w:w="60"/>
+              <w:right w:type="dxa" w:w="100"/>
+            </w:tcMar>
+          </w:tcPr>
+          <w:p>
+            <w:pPr>
+              <w:spacing w:after="0"/>
+            </w:pPr>
+            <w:r>
+              <w:rPr>
+                <w:rFonts w:ascii="Calibri" w:cs="Calibri" w:eastAsia="Calibri" w:hAnsi="Calibri"/>
+                <w:color w:val="5C6560"/>
+                <w:sz w:val="22"/>
+                <w:szCs w:val="22"/>
+              </w:rPr>
+              <w:t xml:space="preserve">□</w:t>
+            </w:r>
+          </w:p>
+        </w:tc>
+      </w:tr>
+      <w:tr>
+        <w:tc>
+          <w:tcPr>
+            <w:tcW w:type="dxa" w:w="3000"/>
+            <w:tcMar>
+              <w:top w:type="dxa" w:w="60"/>
+              <w:left w:type="dxa" w:w="100"/>
+              <w:bottom w:type="dxa" w:w="60"/>
+              <w:right w:type="dxa" w:w="100"/>
+            </w:tcMar>
+          </w:tcPr>
+          <w:p>
+            <w:pPr>
+              <w:spacing w:after="0"/>
+            </w:pPr>
+            <w:r>
+              <w:rPr>
+                <w:rFonts w:ascii="Calibri" w:cs="Calibri" w:eastAsia="Calibri" w:hAnsi="Calibri"/>
+                <w:b/>
+                <w:bCs/>
+                <w:color w:val="14181A"/>
+                <w:sz w:val="19"/>
+                <w:szCs w:val="19"/>
+              </w:rPr>
+              <w:t xml:space="preserve">Bruschetta</w:t>
+            </w:r>
+          </w:p>
+        </w:tc>
+        <w:tc>
+          <w:tcPr>
+            <w:tcW w:type="dxa" w:w="6300"/>
+            <w:tcMar>
+              <w:top w:type="dxa" w:w="60"/>
+              <w:left w:type="dxa" w:w="100"/>
+              <w:bottom w:type="dxa" w:w="60"/>
+              <w:right w:type="dxa" w:w="100"/>
+            </w:tcMar>
+          </w:tcPr>
+          <w:p>
+            <w:pPr>
+              <w:spacing w:after="0"/>
+            </w:pPr>
+            <w:r>
+              <w:rPr>
+                <w:rFonts w:ascii="Calibri" w:cs="Calibri" w:eastAsia="Calibri" w:hAnsi="Calibri"/>
+                <w:color w:val="14181A"/>
+                <w:sz w:val="18"/>
+                <w:szCs w:val="18"/>
+              </w:rPr>
+              <w:t xml:space="preserve">Pipe feta, one tomato slice, balsamic glaze, crispy basil. Build in batches — 20 minutes before the base softens.</w:t>
+            </w:r>
+          </w:p>
+        </w:tc>
+        <w:tc>
+          <w:tcPr>
+            <w:tcW w:type="dxa" w:w="700"/>
+            <w:tcMar>
+              <w:top w:type="dxa" w:w="60"/>
+              <w:left w:type="dxa" w:w="100"/>
+              <w:bottom w:type="dxa" w:w="60"/>
+              <w:right w:type="dxa" w:w="100"/>
+            </w:tcMar>
+          </w:tcPr>
+          <w:p>
+            <w:pPr>
+              <w:spacing w:after="0"/>
+            </w:pPr>
+            <w:r>
+              <w:rPr>
+                <w:rFonts w:ascii="Calibri" w:cs="Calibri" w:eastAsia="Calibri" w:hAnsi="Calibri"/>
+                <w:color w:val="5C6560"/>
+                <w:sz w:val="22"/>
+                <w:szCs w:val="22"/>
+              </w:rPr>
+              <w:t xml:space="preserve">□</w:t>
+            </w:r>
+          </w:p>
+        </w:tc>
+      </w:tr>
+      <w:tr>
+        <w:tc>
+          <w:tcPr>
+            <w:tcW w:type="dxa" w:w="3000"/>
+            <w:tcMar>
+              <w:top w:type="dxa" w:w="60"/>
+              <w:left w:type="dxa" w:w="100"/>
+              <w:bottom w:type="dxa" w:w="60"/>
+              <w:right w:type="dxa" w:w="100"/>
+            </w:tcMar>
+          </w:tcPr>
+          <w:p>
+            <w:pPr>
+              <w:spacing w:after="0"/>
+            </w:pPr>
+            <w:r>
+              <w:rPr>
+                <w:rFonts w:ascii="Calibri" w:cs="Calibri" w:eastAsia="Calibri" w:hAnsi="Calibri"/>
+                <w:b/>
+                <w:bCs/>
+                <w:color w:val="14181A"/>
+                <w:sz w:val="19"/>
+                <w:szCs w:val="19"/>
+              </w:rPr>
+              <w:t xml:space="preserve">Sliders</w:t>
+            </w:r>
+          </w:p>
+        </w:tc>
+        <w:tc>
+          <w:tcPr>
+            <w:tcW w:type="dxa" w:w="6300"/>
+            <w:tcMar>
+              <w:top w:type="dxa" w:w="60"/>
+              <w:left w:type="dxa" w:w="100"/>
+              <w:bottom w:type="dxa" w:w="60"/>
+              <w:right w:type="dxa" w:w="100"/>
+            </w:tcMar>
+          </w:tcPr>
+          <w:p>
+            <w:pPr>
+              <w:spacing w:after="0"/>
+            </w:pPr>
+            <w:r>
+              <w:rPr>
+                <w:rFonts w:ascii="Calibri" w:cs="Calibri" w:eastAsia="Calibri" w:hAnsi="Calibri"/>
+                <w:color w:val="14181A"/>
+                <w:sz w:val="18"/>
+                <w:szCs w:val="18"/>
+              </w:rPr>
+              <w:t xml:space="preserve">13–14 g pulled pork, dressed slaw, lid.</w:t>
+            </w:r>
+          </w:p>
+        </w:tc>
+        <w:tc>
+          <w:tcPr>
+            <w:tcW w:type="dxa" w:w="700"/>
+            <w:tcMar>
+              <w:top w:type="dxa" w:w="60"/>
+              <w:left w:type="dxa" w:w="100"/>
+              <w:bottom w:type="dxa" w:w="60"/>
+              <w:right w:type="dxa" w:w="100"/>
+            </w:tcMar>
+          </w:tcPr>
+          <w:p>
+            <w:pPr>
+              <w:spacing w:after="0"/>
+            </w:pPr>
+            <w:r>
+              <w:rPr>
+                <w:rFonts w:ascii="Calibri" w:cs="Calibri" w:eastAsia="Calibri" w:hAnsi="Calibri"/>
+                <w:color w:val="5C6560"/>
+                <w:sz w:val="22"/>
+                <w:szCs w:val="22"/>
+              </w:rPr>
+              <w:t xml:space="preserve">□</w:t>
+            </w:r>
+          </w:p>
+        </w:tc>
+      </w:tr>
+      <w:tr>
+        <w:tc>
+          <w:tcPr>
+            <w:tcW w:type="dxa" w:w="3000"/>
+            <w:tcMar>
+              <w:top w:type="dxa" w:w="60"/>
+              <w:left w:type="dxa" w:w="100"/>
+              <w:bottom w:type="dxa" w:w="60"/>
+              <w:right w:type="dxa" w:w="100"/>
+            </w:tcMar>
+          </w:tcPr>
+          <w:p>
+            <w:pPr>
+              <w:spacing w:after="0"/>
+            </w:pPr>
+            <w:r>
+              <w:rPr>
+                <w:rFonts w:ascii="Calibri" w:cs="Calibri" w:eastAsia="Calibri" w:hAnsi="Calibri"/>
+                <w:b/>
+                <w:bCs/>
+                <w:color w:val="14181A"/>
+                <w:sz w:val="19"/>
+                <w:szCs w:val="19"/>
+              </w:rPr>
+              <w:t xml:space="preserve">Croquettes</w:t>
+            </w:r>
+          </w:p>
+        </w:tc>
+        <w:tc>
+          <w:tcPr>
+            <w:tcW w:type="dxa" w:w="6300"/>
+            <w:tcMar>
+              <w:top w:type="dxa" w:w="60"/>
+              <w:left w:type="dxa" w:w="100"/>
+              <w:bottom w:type="dxa" w:w="60"/>
+              <w:right w:type="dxa" w:w="100"/>
+            </w:tcMar>
+          </w:tcPr>
+          <w:p>
+            <w:pPr>
+              <w:spacing w:after="0"/>
+            </w:pPr>
+            <w:r>
+              <w:rPr>
+                <w:rFonts w:ascii="Calibri" w:cs="Calibri" w:eastAsia="Calibri" w:hAnsi="Calibri"/>
+                <w:color w:val="14181A"/>
+                <w:sz w:val="18"/>
+                <w:szCs w:val="18"/>
+              </w:rPr>
+              <w:t xml:space="preserve">Fry 3 min. Finish with a dot of anchovy aioli and parmesan shaved to order.</w:t>
+            </w:r>
+          </w:p>
+        </w:tc>
+        <w:tc>
+          <w:tcPr>
+            <w:tcW w:type="dxa" w:w="700"/>
+            <w:tcMar>
+              <w:top w:type="dxa" w:w="60"/>
+              <w:left w:type="dxa" w:w="100"/>
+              <w:bottom w:type="dxa" w:w="60"/>
+              <w:right w:type="dxa" w:w="100"/>
+            </w:tcMar>
+          </w:tcPr>
+          <w:p>
+            <w:pPr>
+              <w:spacing w:after="0"/>
+            </w:pPr>
+            <w:r>
+              <w:rPr>
+                <w:rFonts w:ascii="Calibri" w:cs="Calibri" w:eastAsia="Calibri" w:hAnsi="Calibri"/>
+                <w:color w:val="5C6560"/>
+                <w:sz w:val="22"/>
+                <w:szCs w:val="22"/>
+              </w:rPr>
+              <w:t xml:space="preserve">□</w:t>
+            </w:r>
+          </w:p>
+        </w:tc>
+      </w:tr>
+      <w:tr>
+        <w:tc>
+          <w:tcPr>
+            <w:tcW w:type="dxa" w:w="3000"/>
+            <w:tcMar>
+              <w:top w:type="dxa" w:w="60"/>
+              <w:left w:type="dxa" w:w="100"/>
+              <w:bottom w:type="dxa" w:w="60"/>
+              <w:right w:type="dxa" w:w="100"/>
+            </w:tcMar>
+          </w:tcPr>
+          <w:p>
+            <w:pPr>
+              <w:spacing w:after="0"/>
+            </w:pPr>
+            <w:r>
+              <w:rPr>
+                <w:rFonts w:ascii="Calibri" w:cs="Calibri" w:eastAsia="Calibri" w:hAnsi="Calibri"/>
+                <w:b/>
+                <w:bCs/>
+                <w:color w:val="14181A"/>
+                <w:sz w:val="19"/>
+                <w:szCs w:val="19"/>
+              </w:rPr>
+              <w:t xml:space="preserve">Bombas</w:t>
+            </w:r>
+          </w:p>
+        </w:tc>
+        <w:tc>
+          <w:tcPr>
+            <w:tcW w:type="dxa" w:w="6300"/>
+            <w:tcMar>
+              <w:top w:type="dxa" w:w="60"/>
+              <w:left w:type="dxa" w:w="100"/>
+              <w:bottom w:type="dxa" w:w="60"/>
+              <w:right w:type="dxa" w:w="100"/>
+            </w:tcMar>
+          </w:tcPr>
+          <w:p>
+            <w:pPr>
+              <w:spacing w:after="0"/>
+            </w:pPr>
+            <w:r>
+              <w:rPr>
+                <w:rFonts w:ascii="Calibri" w:cs="Calibri" w:eastAsia="Calibri" w:hAnsi="Calibri"/>
+                <w:color w:val="14181A"/>
+                <w:sz w:val="18"/>
+                <w:szCs w:val="18"/>
+              </w:rPr>
+              <w:t xml:space="preserve">Fry from frozen 60–90 s. Hot honey, thyme crumb.</w:t>
+            </w:r>
+          </w:p>
+        </w:tc>
+        <w:tc>
+          <w:tcPr>
+            <w:tcW w:type="dxa" w:w="700"/>
+            <w:tcMar>
+              <w:top w:type="dxa" w:w="60"/>
+              <w:left w:type="dxa" w:w="100"/>
+              <w:bottom w:type="dxa" w:w="60"/>
+              <w:right w:type="dxa" w:w="100"/>
+            </w:tcMar>
+          </w:tcPr>
+          <w:p>
+            <w:pPr>
+              <w:spacing w:after="0"/>
+            </w:pPr>
+            <w:r>
+              <w:rPr>
+                <w:rFonts w:ascii="Calibri" w:cs="Calibri" w:eastAsia="Calibri" w:hAnsi="Calibri"/>
+                <w:color w:val="5C6560"/>
+                <w:sz w:val="22"/>
+                <w:szCs w:val="22"/>
+              </w:rPr>
+              <w:t xml:space="preserve">□</w:t>
+            </w:r>
+          </w:p>
+        </w:tc>
+      </w:tr>
+      <w:tr>
+        <w:tc>
+          <w:tcPr>
+            <w:tcW w:type="dxa" w:w="3000"/>
+            <w:tcMar>
+              <w:top w:type="dxa" w:w="60"/>
+              <w:left w:type="dxa" w:w="100"/>
+              <w:bottom w:type="dxa" w:w="60"/>
+              <w:right w:type="dxa" w:w="100"/>
+            </w:tcMar>
+          </w:tcPr>
+          <w:p>
+            <w:pPr>
+              <w:spacing w:after="0"/>
+            </w:pPr>
+            <w:r>
+              <w:rPr>
+                <w:rFonts w:ascii="Calibri" w:cs="Calibri" w:eastAsia="Calibri" w:hAnsi="Calibri"/>
+                <w:b/>
+                <w:bCs/>
+                <w:color w:val="14181A"/>
+                <w:sz w:val="19"/>
+                <w:szCs w:val="19"/>
+              </w:rPr>
+              <w:t xml:space="preserve">Hash</w:t>
+            </w:r>
+          </w:p>
+        </w:tc>
+        <w:tc>
+          <w:tcPr>
+            <w:tcW w:type="dxa" w:w="6300"/>
+            <w:tcMar>
+              <w:top w:type="dxa" w:w="60"/>
+              <w:left w:type="dxa" w:w="100"/>
+              <w:bottom w:type="dxa" w:w="60"/>
+              <w:right w:type="dxa" w:w="100"/>
+            </w:tcMar>
+          </w:tcPr>
+          <w:p>
+            <w:pPr>
+              <w:spacing w:after="0"/>
+            </w:pPr>
+            <w:r>
+              <w:rPr>
+                <w:rFonts w:ascii="Calibri" w:cs="Calibri" w:eastAsia="Calibri" w:hAnsi="Calibri"/>
+                <w:color w:val="14181A"/>
+                <w:sz w:val="18"/>
+                <w:szCs w:val="18"/>
+              </w:rPr>
+              <w:t xml:space="preserve">Crisp to order. Miso aioli, caviar, chives.</w:t>
+            </w:r>
+          </w:p>
+        </w:tc>
+        <w:tc>
+          <w:tcPr>
+            <w:tcW w:type="dxa" w:w="700"/>
+            <w:tcMar>
+              <w:top w:type="dxa" w:w="60"/>
+              <w:left w:type="dxa" w:w="100"/>
+              <w:bottom w:type="dxa" w:w="60"/>
+              <w:right w:type="dxa" w:w="100"/>
+            </w:tcMar>
+          </w:tcPr>
+          <w:p>
+            <w:pPr>
+              <w:spacing w:after="0"/>
+            </w:pPr>
+            <w:r>
+              <w:rPr>
+                <w:rFonts w:ascii="Calibri" w:cs="Calibri" w:eastAsia="Calibri" w:hAnsi="Calibri"/>
+                <w:color w:val="5C6560"/>
+                <w:sz w:val="22"/>
+                <w:szCs w:val="22"/>
+              </w:rPr>
+              <w:t xml:space="preserve">□</w:t>
+            </w:r>
+          </w:p>
+        </w:tc>
+      </w:tr>
+    </w:tbl>
     <w:p>
       <w:r>
         <w:br w:type="page"/>

</xml_diff>